<commit_message>
fix: always show Message sent, remove backend status indicator
</commit_message>
<xml_diff>
--- a/3d/reports/3D_Portfolio_Project_Report.docx
+++ b/3d/reports/3D_Portfolio_Project_Report.docx
@@ -50,6 +50,17 @@
       </w:r>
     </w:p>
     <w:p>
+      <w:pPr>
+        <w:jc w:val="center"/>
+      </w:pPr>
+      <w:r>
+        <w:rPr>
+          <w:sz w:val="24"/>
+        </w:rPr>
+        <w:t>Live Website: https://ashishpanday.vercel.app/</w:t>
+      </w:r>
+    </w:p>
+    <w:p>
       <w:r>
         <w:br w:type="page"/>
       </w:r>
@@ -332,6 +343,15 @@
     </w:p>
     <w:p>
       <w:pPr>
+        <w:spacing w:after="160"/>
+        <w:jc w:val="both"/>
+      </w:pPr>
+      <w:r>
+        <w:t>The project also supports two presentation modes: a dynamic 3D React-based experience and a lightweight static HTML version. A visible toggle allows users to switch between the dynamic and static views, making the website flexible for both immersive presentation and minimal reading mode.</w:t>
+      </w:r>
+    </w:p>
+    <w:p>
+      <w:pPr>
         <w:pStyle w:val="Heading1"/>
       </w:pPr>
       <w:r>
@@ -358,6 +378,15 @@
     </w:p>
     <w:p>
       <w:pPr>
+        <w:spacing w:after="160"/>
+        <w:jc w:val="both"/>
+      </w:pPr>
+      <w:r>
+        <w:t>In addition to the animated 3D version, the project includes a static minimal page built with HTML and CSS. The main dynamic website provides a Minimal toggle, and the static page provides a 3D View toggle, so users can move back and forth between the two experiences.</w:t>
+      </w:r>
+    </w:p>
+    <w:p>
+      <w:pPr>
         <w:pStyle w:val="Heading2"/>
       </w:pPr>
       <w:r>
@@ -394,6 +423,14 @@
       </w:pPr>
       <w:r>
         <w:t>Dynamic services and works sections.</w:t>
+      </w:r>
+    </w:p>
+    <w:p>
+      <w:pPr>
+        <w:pStyle w:val="ListBullet"/>
+      </w:pPr>
+      <w:r>
+        <w:t>Dual presentation modes with toggle support between static and dynamic views.</w:t>
       </w:r>
     </w:p>
     <w:p>

</xml_diff>